<commit_message>
Updated jenkins file to build docker image
</commit_message>
<xml_diff>
--- a/Screenshots & Notes/TASK APP week-4.docx
+++ b/Screenshots & Notes/TASK APP week-4.docx
@@ -603,6 +603,23 @@
           <w:lang w:val="en-GB"/>
         </w:rPr>
       </w:pPr>
+    </w:p>
+    <w:p>
+      <w:pPr>
+        <w:numPr>
+          <w:ilvl w:val="0"/>
+          <w:numId w:val="0"/>
+        </w:numPr>
+        <w:spacing w:line="360" w:lineRule="auto"/>
+        <w:ind w:leftChars="0"/>
+        <w:rPr>
+          <w:rFonts w:hint="default"/>
+          <w:sz w:val="24"/>
+          <w:szCs w:val="24"/>
+          <w:shd w:val="clear" w:color="auto" w:fill="auto"/>
+          <w:lang w:val="en-GB"/>
+        </w:rPr>
+      </w:pPr>
       <w:r>
         <w:rPr>
           <w:rFonts w:hint="default"/>
@@ -612,72 +629,1272 @@
           <w:lang w:val="en-GB"/>
         </w:rPr>
         <w:t>Before running the next step confirm that your jenkins server IP is the same. If not change your webhook IP</w:t>
+      </w:r>
+    </w:p>
+    <w:p>
+      <w:pPr>
+        <w:numPr>
+          <w:ilvl w:val="0"/>
+          <w:numId w:val="0"/>
+        </w:numPr>
+        <w:spacing w:line="360" w:lineRule="auto"/>
+        <w:ind w:leftChars="0"/>
+        <w:rPr>
+          <w:rFonts w:hint="default"/>
+          <w:sz w:val="24"/>
+          <w:szCs w:val="24"/>
+          <w:shd w:val="clear" w:color="auto" w:fill="auto"/>
+          <w:lang w:val="en-GB"/>
+        </w:rPr>
+      </w:pPr>
+    </w:p>
+    <w:p>
+      <w:pPr>
+        <w:numPr>
+          <w:ilvl w:val="0"/>
+          <w:numId w:val="1"/>
+        </w:numPr>
+        <w:spacing w:line="360" w:lineRule="auto"/>
+        <w:ind w:left="0" w:leftChars="0" w:firstLine="0" w:firstLineChars="0"/>
+        <w:rPr>
+          <w:rFonts w:hint="default"/>
+          <w:sz w:val="24"/>
+          <w:szCs w:val="24"/>
+          <w:shd w:val="clear" w:color="auto" w:fill="auto"/>
+          <w:lang w:val="en-GB"/>
+        </w:rPr>
+      </w:pPr>
+      <w:r>
+        <w:rPr>
+          <w:rFonts w:hint="default"/>
+          <w:sz w:val="24"/>
+          <w:szCs w:val="24"/>
+          <w:shd w:val="clear" w:color="auto" w:fill="auto"/>
+          <w:lang w:val="en-GB"/>
+        </w:rPr>
+        <w:t xml:space="preserve">Push Dockerfile to GitHub </w:t>
+      </w:r>
+    </w:p>
+    <w:p>
+      <w:pPr>
+        <w:numPr>
+          <w:ilvl w:val="0"/>
+          <w:numId w:val="0"/>
+        </w:numPr>
+        <w:spacing w:line="360" w:lineRule="auto"/>
+        <w:ind w:leftChars="0" w:firstLine="120" w:firstLineChars="50"/>
+        <w:rPr>
+          <w:rFonts w:hint="default"/>
+          <w:sz w:val="24"/>
+          <w:szCs w:val="24"/>
+          <w:shd w:val="clear" w:color="auto" w:fill="auto"/>
+          <w:lang w:val="en-GB"/>
+        </w:rPr>
+      </w:pPr>
+      <w:r>
+        <w:rPr>
+          <w:rFonts w:hint="default"/>
+          <w:sz w:val="24"/>
+          <w:szCs w:val="24"/>
+          <w:shd w:val="clear" w:color="auto" w:fill="auto"/>
+          <w:lang w:val="en-GB"/>
+        </w:rPr>
+        <w:t xml:space="preserve">Run </w:t>
+      </w:r>
+    </w:p>
+    <w:p>
+      <w:pPr>
+        <w:numPr>
+          <w:ilvl w:val="0"/>
+          <w:numId w:val="0"/>
+        </w:numPr>
+        <w:spacing w:line="360" w:lineRule="auto"/>
+        <w:ind w:leftChars="0" w:firstLine="120" w:firstLineChars="50"/>
+        <w:rPr>
+          <w:rFonts w:hint="default"/>
+          <w:sz w:val="24"/>
+          <w:szCs w:val="24"/>
+          <w:shd w:val="clear" w:color="FFFFFF" w:fill="D9D9D9"/>
+          <w:lang w:val="en-GB"/>
+        </w:rPr>
+      </w:pPr>
+      <w:r>
+        <w:rPr>
+          <w:rFonts w:hint="default"/>
+          <w:sz w:val="24"/>
+          <w:szCs w:val="24"/>
+          <w:shd w:val="clear" w:color="FFFFFF" w:fill="D9D9D9"/>
+          <w:lang w:val="en-GB"/>
+        </w:rPr>
+        <w:t>git add Dockerfile</w:t>
+      </w:r>
+    </w:p>
+    <w:p>
+      <w:pPr>
+        <w:numPr>
+          <w:ilvl w:val="0"/>
+          <w:numId w:val="0"/>
+        </w:numPr>
+        <w:spacing w:line="360" w:lineRule="auto"/>
+        <w:ind w:leftChars="0" w:firstLine="120" w:firstLineChars="50"/>
+        <w:rPr>
+          <w:rFonts w:hint="default"/>
+          <w:sz w:val="24"/>
+          <w:szCs w:val="24"/>
+          <w:shd w:val="clear" w:color="FFFFFF" w:fill="D9D9D9"/>
+          <w:lang w:val="en-GB"/>
+        </w:rPr>
+      </w:pPr>
+      <w:r>
+        <w:rPr>
+          <w:rFonts w:hint="default"/>
+          <w:sz w:val="24"/>
+          <w:szCs w:val="24"/>
+          <w:shd w:val="clear" w:color="FFFFFF" w:fill="D9D9D9"/>
+          <w:lang w:val="en-GB"/>
+        </w:rPr>
+        <w:t>git commit -m "Add Dockerfile for containerization"</w:t>
+      </w:r>
+    </w:p>
+    <w:p>
+      <w:pPr>
+        <w:numPr>
+          <w:ilvl w:val="0"/>
+          <w:numId w:val="0"/>
+        </w:numPr>
+        <w:spacing w:line="360" w:lineRule="auto"/>
+        <w:ind w:leftChars="0" w:firstLine="120" w:firstLineChars="50"/>
+        <w:rPr>
+          <w:rFonts w:hint="default"/>
+          <w:sz w:val="24"/>
+          <w:szCs w:val="24"/>
+          <w:shd w:val="clear" w:color="auto" w:fill="auto"/>
+          <w:lang w:val="en-GB"/>
+        </w:rPr>
+      </w:pPr>
+      <w:r>
+        <w:rPr>
+          <w:rFonts w:hint="default"/>
+          <w:sz w:val="24"/>
+          <w:szCs w:val="24"/>
+          <w:shd w:val="clear" w:color="FFFFFF" w:fill="D9D9D9"/>
+          <w:lang w:val="en-GB"/>
+        </w:rPr>
+        <w:t xml:space="preserve">git push </w:t>
+      </w:r>
+      <w:r>
+        <w:rPr>
+          <w:rFonts w:hint="default"/>
+          <w:sz w:val="24"/>
+          <w:szCs w:val="24"/>
+          <w:shd w:val="clear" w:color="auto" w:fill="auto"/>
+          <w:lang w:val="en-GB"/>
+        </w:rPr>
+        <w:t xml:space="preserve"> </w:t>
+      </w:r>
+    </w:p>
+    <w:p>
+      <w:pPr>
+        <w:numPr>
+          <w:ilvl w:val="0"/>
+          <w:numId w:val="0"/>
+        </w:numPr>
+        <w:spacing w:line="360" w:lineRule="auto"/>
+        <w:rPr>
+          <w:rFonts w:hint="default"/>
+          <w:sz w:val="24"/>
+          <w:szCs w:val="24"/>
+          <w:shd w:val="clear" w:color="auto" w:fill="auto"/>
+          <w:lang w:val="en-GB"/>
+        </w:rPr>
+      </w:pPr>
+      <w:r>
+        <w:rPr>
+          <w:rFonts w:hint="default"/>
+          <w:sz w:val="24"/>
+          <w:szCs w:val="24"/>
+          <w:shd w:val="clear" w:color="auto" w:fill="auto"/>
+          <w:lang w:val="en-GB"/>
+        </w:rPr>
+        <w:t>Explanation:</w:t>
+      </w:r>
+    </w:p>
+    <w:p>
+      <w:pPr>
+        <w:numPr>
+          <w:ilvl w:val="0"/>
+          <w:numId w:val="0"/>
+        </w:numPr>
+        <w:spacing w:line="360" w:lineRule="auto"/>
+        <w:rPr>
+          <w:rFonts w:hint="default"/>
+          <w:sz w:val="24"/>
+          <w:szCs w:val="24"/>
+          <w:shd w:val="clear" w:color="auto" w:fill="auto"/>
+          <w:lang w:val="en-GB"/>
+        </w:rPr>
+      </w:pPr>
+      <w:r>
+        <w:rPr>
+          <w:rFonts w:hint="default"/>
+          <w:sz w:val="24"/>
+          <w:szCs w:val="24"/>
+          <w:shd w:val="clear" w:color="auto" w:fill="auto"/>
+          <w:lang w:val="en-GB"/>
+        </w:rPr>
+        <w:t>This uploads the Dockerfile to your GitHub repository so Jenkins can access it when running the CI pipeline.</w:t>
+      </w:r>
+    </w:p>
+    <w:p>
+      <w:pPr>
+        <w:numPr>
+          <w:ilvl w:val="0"/>
+          <w:numId w:val="0"/>
+        </w:numPr>
+        <w:spacing w:line="360" w:lineRule="auto"/>
+        <w:rPr>
+          <w:rFonts w:hint="default"/>
+          <w:sz w:val="24"/>
+          <w:szCs w:val="24"/>
+          <w:shd w:val="clear" w:color="auto" w:fill="auto"/>
+          <w:lang w:val="en-GB"/>
+        </w:rPr>
+      </w:pPr>
+      <w:r>
+        <w:rPr>
+          <w:rFonts w:hint="default"/>
+          <w:sz w:val="24"/>
+          <w:szCs w:val="24"/>
+          <w:shd w:val="clear" w:color="auto" w:fill="auto"/>
+          <w:lang w:val="en-GB"/>
+        </w:rPr>
+        <w:t>Because Jenkins is connected to GitHub through the webhook, pushing new code will automatically trigger a new Jenkins build.</w:t>
+      </w:r>
+    </w:p>
+    <w:p>
+      <w:pPr>
+        <w:numPr>
+          <w:ilvl w:val="0"/>
+          <w:numId w:val="0"/>
+        </w:numPr>
+        <w:spacing w:line="360" w:lineRule="auto"/>
+        <w:rPr>
+          <w:rFonts w:hint="default"/>
+          <w:sz w:val="24"/>
+          <w:szCs w:val="24"/>
+          <w:shd w:val="clear" w:color="auto" w:fill="auto"/>
+          <w:lang w:val="en-GB"/>
+        </w:rPr>
+      </w:pPr>
+    </w:p>
+    <w:p>
+      <w:pPr>
+        <w:numPr>
+          <w:ilvl w:val="0"/>
+          <w:numId w:val="1"/>
+        </w:numPr>
+        <w:spacing w:line="360" w:lineRule="auto"/>
+        <w:ind w:left="0" w:leftChars="0" w:firstLine="0" w:firstLineChars="0"/>
+        <w:rPr>
+          <w:rFonts w:hint="default"/>
+          <w:sz w:val="24"/>
+          <w:szCs w:val="24"/>
+          <w:shd w:val="clear" w:color="auto" w:fill="auto"/>
+          <w:lang w:val="en-GB"/>
+        </w:rPr>
+      </w:pPr>
+      <w:r>
+        <w:rPr>
+          <w:rFonts w:hint="default"/>
+          <w:sz w:val="24"/>
+          <w:szCs w:val="24"/>
+          <w:shd w:val="clear" w:color="auto" w:fill="auto"/>
+          <w:lang w:val="en-GB"/>
+        </w:rPr>
+        <w:t xml:space="preserve">install Docker on Jenkins Server </w:t>
+      </w:r>
+    </w:p>
+    <w:p>
+      <w:pPr>
+        <w:numPr>
+          <w:ilvl w:val="0"/>
+          <w:numId w:val="0"/>
+        </w:numPr>
+        <w:spacing w:line="360" w:lineRule="auto"/>
+        <w:ind w:leftChars="0"/>
+        <w:rPr>
+          <w:rFonts w:hint="default"/>
+          <w:sz w:val="24"/>
+          <w:szCs w:val="24"/>
+          <w:shd w:val="clear" w:color="FFFFFF" w:fill="D9D9D9"/>
+          <w:lang w:val="en-GB"/>
+        </w:rPr>
+      </w:pPr>
+      <w:r>
+        <w:rPr>
+          <w:rFonts w:hint="default"/>
+          <w:sz w:val="24"/>
+          <w:szCs w:val="24"/>
+          <w:shd w:val="clear" w:color="auto" w:fill="auto"/>
+          <w:lang w:val="en-GB"/>
+        </w:rPr>
+        <w:t xml:space="preserve">On your EC2 Jenkins server run: </w:t>
+      </w:r>
+      <w:r>
+        <w:rPr>
+          <w:rFonts w:hint="default"/>
+          <w:sz w:val="24"/>
+          <w:szCs w:val="24"/>
+          <w:shd w:val="clear" w:color="FFFFFF" w:fill="D9D9D9"/>
+          <w:lang w:val="en-GB"/>
+        </w:rPr>
+        <w:t>sudo apt update</w:t>
+      </w:r>
+    </w:p>
+    <w:p>
+      <w:pPr>
+        <w:numPr>
+          <w:ilvl w:val="0"/>
+          <w:numId w:val="0"/>
+        </w:numPr>
+        <w:spacing w:line="360" w:lineRule="auto"/>
+        <w:ind w:leftChars="0"/>
+        <w:rPr>
+          <w:rFonts w:hint="default"/>
+          <w:sz w:val="24"/>
+          <w:szCs w:val="24"/>
+          <w:shd w:val="clear" w:color="auto" w:fill="auto"/>
+          <w:lang w:val="en-GB"/>
+        </w:rPr>
+      </w:pPr>
+      <w:r>
+        <w:rPr>
+          <w:rFonts w:hint="default"/>
+          <w:sz w:val="24"/>
+          <w:szCs w:val="24"/>
+          <w:shd w:val="clear" w:color="FFFFFF" w:fill="D9D9D9"/>
+          <w:lang w:val="en-GB"/>
+        </w:rPr>
+        <w:t xml:space="preserve">sudo apt install docker.io -y </w:t>
+      </w:r>
+      <w:r>
+        <w:rPr>
+          <w:rFonts w:hint="default"/>
+          <w:sz w:val="24"/>
+          <w:szCs w:val="24"/>
+          <w:shd w:val="clear" w:color="auto" w:fill="auto"/>
+          <w:lang w:val="en-GB"/>
+        </w:rPr>
+        <w:t xml:space="preserve">  </w:t>
+      </w:r>
+    </w:p>
+    <w:p>
+      <w:pPr>
+        <w:numPr>
+          <w:ilvl w:val="0"/>
+          <w:numId w:val="0"/>
+        </w:numPr>
+        <w:spacing w:line="360" w:lineRule="auto"/>
+        <w:rPr>
+          <w:rFonts w:hint="default"/>
+          <w:sz w:val="24"/>
+          <w:szCs w:val="24"/>
+          <w:shd w:val="clear" w:color="auto" w:fill="auto"/>
+          <w:lang w:val="en-GB"/>
+        </w:rPr>
+      </w:pPr>
+      <w:r>
+        <w:rPr>
+          <w:rFonts w:hint="default"/>
+          <w:sz w:val="24"/>
+          <w:szCs w:val="24"/>
+          <w:shd w:val="clear" w:color="auto" w:fill="auto"/>
+          <w:lang w:val="en-GB"/>
+        </w:rPr>
+        <w:t>Explanation:</w:t>
+      </w:r>
+      <w:r>
+        <w:rPr>
+          <w:rFonts w:hint="default"/>
+          <w:sz w:val="24"/>
+          <w:szCs w:val="24"/>
+          <w:shd w:val="clear" w:color="auto" w:fill="auto"/>
+          <w:lang w:val="en-GB"/>
+        </w:rPr>
+        <w:br w:type="textWrapping"/>
+      </w:r>
+      <w:r>
+        <w:rPr>
+          <w:rFonts w:hint="default"/>
+          <w:sz w:val="24"/>
+          <w:szCs w:val="24"/>
+          <w:shd w:val="clear" w:color="auto" w:fill="auto"/>
+          <w:lang w:val="en-GB"/>
+        </w:rPr>
+        <w:t>This installs Docker on the Jenkins server so the CI pipeline can build and run  container images during automated builds.</w:t>
+      </w:r>
+    </w:p>
+    <w:p>
+      <w:pPr>
+        <w:numPr>
+          <w:ilvl w:val="0"/>
+          <w:numId w:val="0"/>
+        </w:numPr>
+        <w:spacing w:line="360" w:lineRule="auto"/>
+        <w:rPr>
+          <w:rFonts w:hint="default"/>
+          <w:sz w:val="24"/>
+          <w:szCs w:val="24"/>
+          <w:shd w:val="clear" w:color="auto" w:fill="auto"/>
+          <w:lang w:val="en-GB"/>
+        </w:rPr>
+      </w:pPr>
+    </w:p>
+    <w:p>
+      <w:pPr>
+        <w:numPr>
+          <w:ilvl w:val="0"/>
+          <w:numId w:val="1"/>
+        </w:numPr>
+        <w:spacing w:line="360" w:lineRule="auto"/>
+        <w:ind w:left="0" w:leftChars="0" w:firstLine="0" w:firstLineChars="0"/>
+        <w:rPr>
+          <w:rFonts w:hint="default"/>
+          <w:sz w:val="24"/>
+          <w:szCs w:val="24"/>
+          <w:shd w:val="clear" w:color="FFFFFF" w:fill="D9D9D9"/>
+          <w:lang w:val="en-GB"/>
+        </w:rPr>
+      </w:pPr>
+      <w:r>
+        <w:rPr>
+          <w:rFonts w:hint="default"/>
+          <w:sz w:val="24"/>
+          <w:szCs w:val="24"/>
+          <w:shd w:val="clear" w:color="auto" w:fill="auto"/>
+          <w:lang w:val="en-GB"/>
+        </w:rPr>
+        <w:t xml:space="preserve"> Then run: </w:t>
+      </w:r>
+      <w:r>
+        <w:rPr>
+          <w:rFonts w:hint="default"/>
+          <w:sz w:val="24"/>
+          <w:szCs w:val="24"/>
+          <w:shd w:val="clear" w:color="FFFFFF" w:fill="D9D9D9"/>
+          <w:lang w:val="en-GB"/>
+        </w:rPr>
+        <w:t xml:space="preserve">sudo systemctl start docker  </w:t>
+      </w:r>
+      <w:r>
+        <w:rPr>
+          <w:rFonts w:hint="default"/>
+          <w:sz w:val="24"/>
+          <w:szCs w:val="24"/>
+          <w:shd w:val="clear" w:color="auto" w:fill="auto"/>
+          <w:lang w:val="en-GB"/>
+        </w:rPr>
+        <w:t xml:space="preserve">    </w:t>
+      </w:r>
+      <w:r>
+        <w:rPr>
+          <w:rFonts w:hint="default"/>
+          <w:sz w:val="24"/>
+          <w:szCs w:val="24"/>
+          <w:shd w:val="clear" w:color="FFFFFF" w:fill="D9D9D9"/>
+          <w:lang w:val="en-GB"/>
+        </w:rPr>
+        <w:t xml:space="preserve">sudo systemctl enable docker </w:t>
+      </w:r>
+    </w:p>
+    <w:p>
+      <w:pPr>
+        <w:numPr>
+          <w:numId w:val="0"/>
+        </w:numPr>
+        <w:spacing w:line="360" w:lineRule="auto"/>
+        <w:ind w:leftChars="0"/>
+        <w:rPr>
+          <w:rFonts w:hint="default"/>
+          <w:sz w:val="24"/>
+          <w:szCs w:val="24"/>
+          <w:shd w:val="clear" w:color="auto" w:fill="auto"/>
+          <w:lang w:val="en-GB"/>
+        </w:rPr>
+      </w:pPr>
+      <w:r>
+        <w:rPr>
+          <w:rFonts w:hint="default"/>
+          <w:sz w:val="24"/>
+          <w:szCs w:val="24"/>
+          <w:shd w:val="clear" w:color="auto" w:fill="auto"/>
+          <w:lang w:val="en-GB"/>
+        </w:rPr>
+        <w:t>Explanation:</w:t>
+      </w:r>
+      <w:r>
+        <w:rPr>
+          <w:rFonts w:hint="default"/>
+          <w:sz w:val="24"/>
+          <w:szCs w:val="24"/>
+          <w:shd w:val="clear" w:color="auto" w:fill="auto"/>
+          <w:lang w:val="en-GB"/>
+        </w:rPr>
+        <w:br w:type="textWrapping"/>
+      </w:r>
+      <w:r>
+        <w:rPr>
+          <w:rFonts w:hint="default"/>
+          <w:sz w:val="24"/>
+          <w:szCs w:val="24"/>
+          <w:shd w:val="clear" w:color="auto" w:fill="auto"/>
+          <w:lang w:val="en-GB"/>
+        </w:rPr>
+        <w:t>This starts the Docker service and ensures Docker starts automatically whenever the server restarts.</w:t>
+      </w:r>
+    </w:p>
+    <w:p>
+      <w:pPr>
+        <w:numPr>
+          <w:ilvl w:val="0"/>
+          <w:numId w:val="0"/>
+        </w:numPr>
+        <w:spacing w:line="360" w:lineRule="auto"/>
+        <w:rPr>
+          <w:rFonts w:hint="default"/>
+          <w:sz w:val="24"/>
+          <w:szCs w:val="24"/>
+          <w:shd w:val="clear" w:color="auto" w:fill="auto"/>
+          <w:lang w:val="en-GB"/>
+        </w:rPr>
+      </w:pPr>
+    </w:p>
+    <w:p>
+      <w:pPr>
+        <w:numPr>
+          <w:numId w:val="0"/>
+        </w:numPr>
+        <w:spacing w:line="360" w:lineRule="auto"/>
+        <w:ind w:leftChars="0"/>
+        <w:rPr>
+          <w:rFonts w:hint="default"/>
+          <w:sz w:val="24"/>
+          <w:szCs w:val="24"/>
+          <w:shd w:val="clear" w:color="auto" w:fill="auto"/>
+          <w:lang w:val="en-GB"/>
+        </w:rPr>
+      </w:pPr>
+    </w:p>
+    <w:p>
+      <w:pPr>
+        <w:numPr>
+          <w:ilvl w:val="0"/>
+          <w:numId w:val="1"/>
+        </w:numPr>
+        <w:spacing w:line="360" w:lineRule="auto"/>
+        <w:ind w:left="0" w:leftChars="0" w:firstLine="0" w:firstLineChars="0"/>
+        <w:rPr>
+          <w:rFonts w:hint="default"/>
+          <w:sz w:val="24"/>
+          <w:szCs w:val="24"/>
+          <w:shd w:val="clear" w:color="auto" w:fill="auto"/>
+          <w:lang w:val="en-GB"/>
+        </w:rPr>
+      </w:pPr>
+      <w:r>
+        <w:rPr>
+          <w:rFonts w:hint="default"/>
+          <w:sz w:val="24"/>
+          <w:szCs w:val="24"/>
+          <w:shd w:val="clear" w:color="auto" w:fill="auto"/>
+          <w:lang w:val="en-GB"/>
+        </w:rPr>
+        <w:t>Allow Jenkins to Use Docker</w:t>
+      </w:r>
+    </w:p>
+    <w:p>
+      <w:pPr>
+        <w:numPr>
+          <w:ilvl w:val="0"/>
+          <w:numId w:val="0"/>
+        </w:numPr>
+        <w:spacing w:line="360" w:lineRule="auto"/>
+        <w:ind w:leftChars="0"/>
+        <w:rPr>
+          <w:rFonts w:hint="default"/>
+          <w:sz w:val="24"/>
+          <w:szCs w:val="24"/>
+          <w:shd w:val="clear" w:color="auto" w:fill="auto"/>
+          <w:lang w:val="en-GB"/>
+        </w:rPr>
+      </w:pPr>
+      <w:r>
+        <w:rPr>
+          <w:rFonts w:hint="default"/>
+          <w:sz w:val="24"/>
+          <w:szCs w:val="24"/>
+          <w:shd w:val="clear" w:color="auto" w:fill="auto"/>
+          <w:lang w:val="en-GB"/>
+        </w:rPr>
+        <w:t xml:space="preserve">Run this: </w:t>
+      </w:r>
+      <w:r>
+        <w:rPr>
+          <w:rFonts w:hint="default"/>
+          <w:sz w:val="24"/>
+          <w:szCs w:val="24"/>
+          <w:shd w:val="clear" w:color="FFFFFF" w:fill="D9D9D9"/>
+          <w:lang w:val="en-GB"/>
+        </w:rPr>
+        <w:t>sudo usermod -aG docker jenkins</w:t>
+      </w:r>
+      <w:r>
+        <w:rPr>
+          <w:rFonts w:hint="default"/>
+          <w:sz w:val="24"/>
+          <w:szCs w:val="24"/>
+          <w:shd w:val="clear" w:color="FFFFFF" w:fill="D9D9D9"/>
+          <w:lang w:val="en-GB"/>
+        </w:rPr>
+        <w:br w:type="textWrapping"/>
+      </w:r>
+      <w:r>
+        <w:rPr>
+          <w:rFonts w:hint="default"/>
+          <w:sz w:val="24"/>
+          <w:szCs w:val="24"/>
+          <w:shd w:val="clear" w:color="FFFFFF" w:fill="D9D9D9"/>
+          <w:lang w:val="en-GB"/>
+        </w:rPr>
+        <w:t>sudo systemctl restart jenkins</w:t>
+      </w:r>
+      <w:r>
+        <w:rPr>
+          <w:rFonts w:hint="default"/>
+          <w:sz w:val="24"/>
+          <w:szCs w:val="24"/>
+          <w:shd w:val="clear" w:color="auto" w:fill="auto"/>
+          <w:lang w:val="en-GB"/>
+        </w:rPr>
+        <w:t xml:space="preserve"> </w:t>
+      </w:r>
+    </w:p>
+    <w:p>
+      <w:pPr>
+        <w:numPr>
+          <w:ilvl w:val="0"/>
+          <w:numId w:val="0"/>
+        </w:numPr>
+        <w:spacing w:line="360" w:lineRule="auto"/>
+        <w:ind w:leftChars="0"/>
+        <w:rPr>
+          <w:rFonts w:hint="default"/>
+          <w:sz w:val="24"/>
+          <w:szCs w:val="24"/>
+          <w:shd w:val="clear" w:color="auto" w:fill="auto"/>
+          <w:lang w:val="en-GB"/>
+        </w:rPr>
+      </w:pPr>
+      <w:r>
+        <w:rPr>
+          <w:rFonts w:hint="default"/>
+          <w:sz w:val="24"/>
+          <w:szCs w:val="24"/>
+          <w:shd w:val="clear" w:color="auto" w:fill="auto"/>
+          <w:lang w:val="en-GB"/>
+        </w:rPr>
+        <w:t>Explanation:</w:t>
+      </w:r>
+      <w:r>
+        <w:rPr>
+          <w:rFonts w:hint="default"/>
+          <w:sz w:val="24"/>
+          <w:szCs w:val="24"/>
+          <w:shd w:val="clear" w:color="auto" w:fill="auto"/>
+          <w:lang w:val="en-GB"/>
+        </w:rPr>
+        <w:br w:type="textWrapping"/>
+      </w:r>
+      <w:r>
+        <w:rPr>
+          <w:rFonts w:hint="default"/>
+          <w:sz w:val="24"/>
+          <w:szCs w:val="24"/>
+          <w:shd w:val="clear" w:color="auto" w:fill="auto"/>
+          <w:lang w:val="en-GB"/>
+        </w:rPr>
+        <w:t>Jenkins runs under its own user account, so we grant it permission to run Docker commands.</w:t>
+      </w:r>
+    </w:p>
+    <w:p>
+      <w:pPr>
+        <w:numPr>
+          <w:ilvl w:val="0"/>
+          <w:numId w:val="0"/>
+        </w:numPr>
+        <w:spacing w:line="360" w:lineRule="auto"/>
+        <w:ind w:leftChars="0"/>
+        <w:rPr>
+          <w:rFonts w:hint="default"/>
+          <w:sz w:val="24"/>
+          <w:szCs w:val="24"/>
+          <w:shd w:val="clear" w:color="auto" w:fill="auto"/>
+          <w:lang w:val="en-GB"/>
+        </w:rPr>
+      </w:pPr>
+      <w:r>
+        <w:rPr>
+          <w:rFonts w:hint="default"/>
+          <w:sz w:val="24"/>
+          <w:szCs w:val="24"/>
+          <w:shd w:val="clear" w:color="auto" w:fill="auto"/>
+          <w:lang w:val="en-GB"/>
+        </w:rPr>
+        <w:t>Without this, Jenkins pipelines will fail when trying to build Docker images.</w:t>
+      </w:r>
+    </w:p>
+    <w:p>
+      <w:pPr>
+        <w:numPr>
+          <w:ilvl w:val="0"/>
+          <w:numId w:val="0"/>
+        </w:numPr>
+        <w:spacing w:line="360" w:lineRule="auto"/>
+        <w:ind w:leftChars="0"/>
+        <w:rPr>
+          <w:rFonts w:hint="default"/>
+          <w:sz w:val="24"/>
+          <w:szCs w:val="24"/>
+          <w:shd w:val="clear" w:color="auto" w:fill="auto"/>
+          <w:lang w:val="en-GB"/>
+        </w:rPr>
+      </w:pPr>
+      <w:r>
+        <w:rPr>
+          <w:rFonts w:hint="default"/>
+          <w:sz w:val="24"/>
+          <w:szCs w:val="24"/>
+          <w:shd w:val="clear" w:color="auto" w:fill="auto"/>
+          <w:lang w:val="en-GB"/>
+        </w:rPr>
+        <w:t>See it like this, Jenkins is just a server. If we want Jenkins to build Docker images, Docker must be installed on that server.</w:t>
+      </w:r>
+    </w:p>
+    <w:p>
+      <w:pPr>
+        <w:numPr>
+          <w:ilvl w:val="0"/>
+          <w:numId w:val="0"/>
+        </w:numPr>
+        <w:spacing w:line="360" w:lineRule="auto"/>
+        <w:ind w:leftChars="0"/>
+        <w:rPr>
+          <w:rFonts w:hint="default"/>
+          <w:sz w:val="24"/>
+          <w:szCs w:val="24"/>
+          <w:shd w:val="clear" w:color="auto" w:fill="auto"/>
+          <w:lang w:val="en-GB"/>
+        </w:rPr>
+      </w:pPr>
+    </w:p>
+    <w:p>
+      <w:pPr>
+        <w:numPr>
+          <w:ilvl w:val="0"/>
+          <w:numId w:val="1"/>
+        </w:numPr>
+        <w:spacing w:line="360" w:lineRule="auto"/>
+        <w:ind w:left="0" w:leftChars="0" w:firstLine="0" w:firstLineChars="0"/>
+        <w:rPr>
+          <w:rFonts w:hint="default"/>
+          <w:sz w:val="24"/>
+          <w:szCs w:val="24"/>
+          <w:shd w:val="clear" w:color="auto" w:fill="auto"/>
+          <w:lang w:val="en-GB"/>
+        </w:rPr>
+      </w:pPr>
+      <w:r>
+        <w:rPr>
+          <w:rFonts w:hint="default"/>
+          <w:sz w:val="24"/>
+          <w:szCs w:val="24"/>
+          <w:shd w:val="clear" w:color="auto" w:fill="auto"/>
+          <w:lang w:val="en-GB"/>
+        </w:rPr>
+        <w:t>Update the Jenkins Pipeline (jenkinsfile) to Build the Docker Image</w:t>
+      </w:r>
+    </w:p>
+    <w:p>
+      <w:pPr>
+        <w:numPr>
+          <w:numId w:val="0"/>
+        </w:numPr>
+        <w:spacing w:line="360" w:lineRule="auto"/>
+        <w:ind w:leftChars="0"/>
+        <w:rPr>
+          <w:rFonts w:hint="default"/>
+          <w:sz w:val="24"/>
+          <w:szCs w:val="24"/>
+          <w:shd w:val="clear" w:color="auto" w:fill="auto"/>
+          <w:lang w:val="en-GB"/>
+        </w:rPr>
+      </w:pPr>
+      <w:r>
+        <w:rPr>
+          <w:rFonts w:hint="default"/>
+          <w:sz w:val="24"/>
+          <w:szCs w:val="24"/>
+          <w:shd w:val="clear" w:color="auto" w:fill="auto"/>
+          <w:lang w:val="en-GB"/>
+        </w:rPr>
+        <w:t>In week 3 jenkins pipele we added just two stages</w:t>
+      </w:r>
+    </w:p>
+    <w:p>
+      <w:pPr>
+        <w:numPr>
+          <w:ilvl w:val="0"/>
+          <w:numId w:val="2"/>
+        </w:numPr>
+        <w:spacing w:line="360" w:lineRule="auto"/>
+        <w:ind w:left="425" w:leftChars="0" w:hanging="425" w:firstLineChars="0"/>
+        <w:rPr>
+          <w:rFonts w:hint="default"/>
+          <w:sz w:val="24"/>
+          <w:szCs w:val="24"/>
+          <w:shd w:val="clear" w:color="auto" w:fill="auto"/>
+          <w:lang w:val="en-GB"/>
+        </w:rPr>
+      </w:pPr>
+      <w:r>
+        <w:rPr>
+          <w:rFonts w:hint="default"/>
+          <w:sz w:val="24"/>
+          <w:szCs w:val="24"/>
+          <w:shd w:val="clear" w:color="auto" w:fill="auto"/>
+          <w:lang w:val="en-GB"/>
+        </w:rPr>
+        <w:t>Install dependencies</w:t>
+      </w:r>
+    </w:p>
+    <w:p>
+      <w:pPr>
+        <w:numPr>
+          <w:ilvl w:val="0"/>
+          <w:numId w:val="2"/>
+        </w:numPr>
+        <w:spacing w:line="360" w:lineRule="auto"/>
+        <w:ind w:left="425" w:leftChars="0" w:hanging="425" w:firstLineChars="0"/>
+        <w:rPr>
+          <w:rFonts w:hint="default"/>
+          <w:sz w:val="24"/>
+          <w:szCs w:val="24"/>
+          <w:shd w:val="clear" w:color="auto" w:fill="auto"/>
+          <w:lang w:val="en-GB"/>
+        </w:rPr>
+      </w:pPr>
+      <w:r>
+        <w:rPr>
+          <w:rFonts w:hint="default"/>
+          <w:sz w:val="24"/>
+          <w:szCs w:val="24"/>
+          <w:shd w:val="clear" w:color="auto" w:fill="auto"/>
+          <w:lang w:val="en-GB"/>
+        </w:rPr>
+        <w:t>Verify Node is installed</w:t>
+      </w:r>
+    </w:p>
+    <w:p>
+      <w:pPr>
+        <w:numPr>
+          <w:numId w:val="0"/>
+        </w:numPr>
+        <w:spacing w:line="360" w:lineRule="auto"/>
+        <w:ind w:leftChars="0"/>
+        <w:rPr>
+          <w:rFonts w:hint="default"/>
+          <w:sz w:val="24"/>
+          <w:szCs w:val="24"/>
+          <w:shd w:val="clear" w:color="auto" w:fill="auto"/>
+          <w:lang w:val="en-GB"/>
+        </w:rPr>
+      </w:pPr>
+      <w:r>
+        <w:rPr>
+          <w:rFonts w:hint="default"/>
+          <w:sz w:val="24"/>
+          <w:szCs w:val="24"/>
+          <w:shd w:val="clear" w:color="auto" w:fill="auto"/>
+          <w:lang w:val="en-GB"/>
+        </w:rPr>
+        <w:t>That means Jenkins is only testing the environment, not building the container yet.</w:t>
+      </w:r>
+    </w:p>
+    <w:p>
+      <w:pPr>
+        <w:numPr>
+          <w:numId w:val="0"/>
+        </w:numPr>
+        <w:spacing w:line="360" w:lineRule="auto"/>
+        <w:ind w:leftChars="0"/>
+        <w:rPr>
+          <w:rFonts w:hint="default"/>
+          <w:sz w:val="24"/>
+          <w:szCs w:val="24"/>
+          <w:shd w:val="clear" w:color="auto" w:fill="auto"/>
+          <w:lang w:val="en-GB"/>
+        </w:rPr>
+      </w:pPr>
+      <w:r>
+        <w:rPr>
+          <w:rFonts w:hint="default"/>
+          <w:sz w:val="24"/>
+          <w:szCs w:val="24"/>
+          <w:shd w:val="clear" w:color="auto" w:fill="auto"/>
+          <w:lang w:val="en-GB"/>
+        </w:rPr>
+        <w:t>To complete Week 4 , we just need to add one more stage.</w:t>
+      </w:r>
+    </w:p>
+    <w:p>
+      <w:pPr>
+        <w:numPr>
+          <w:numId w:val="0"/>
+        </w:numPr>
+        <w:spacing w:line="360" w:lineRule="auto"/>
+        <w:ind w:leftChars="0"/>
+        <w:rPr>
+          <w:rFonts w:hint="default"/>
+          <w:sz w:val="24"/>
+          <w:szCs w:val="24"/>
+          <w:shd w:val="clear" w:color="auto" w:fill="auto"/>
+          <w:lang w:val="en-GB"/>
+        </w:rPr>
+      </w:pPr>
+      <w:r>
+        <w:rPr>
+          <w:rFonts w:hint="default"/>
+          <w:sz w:val="24"/>
+          <w:szCs w:val="24"/>
+          <w:shd w:val="clear" w:color="auto" w:fill="auto"/>
+          <w:lang w:val="en-GB"/>
+        </w:rPr>
+        <w:t>So now jenkins will</w:t>
+      </w:r>
+    </w:p>
+    <w:p>
+      <w:pPr>
+        <w:numPr>
+          <w:numId w:val="0"/>
+        </w:numPr>
+        <w:spacing w:line="360" w:lineRule="auto"/>
+        <w:ind w:leftChars="0"/>
+        <w:rPr>
+          <w:rFonts w:hint="default"/>
+          <w:sz w:val="24"/>
+          <w:szCs w:val="24"/>
+          <w:shd w:val="clear" w:color="auto" w:fill="auto"/>
+          <w:lang w:val="en-GB"/>
+        </w:rPr>
+      </w:pPr>
+    </w:p>
+    <w:p>
+      <w:pPr>
+        <w:numPr>
+          <w:numId w:val="0"/>
+        </w:numPr>
+        <w:spacing w:line="360" w:lineRule="auto"/>
+        <w:ind w:leftChars="0"/>
+        <w:rPr>
+          <w:rFonts w:hint="default"/>
+          <w:sz w:val="24"/>
+          <w:szCs w:val="24"/>
+          <w:shd w:val="clear" w:color="auto" w:fill="auto"/>
+          <w:lang w:val="en-GB"/>
+        </w:rPr>
+      </w:pPr>
+      <w:r>
+        <w:rPr>
+          <w:rFonts w:hint="default"/>
+          <w:sz w:val="24"/>
+          <w:szCs w:val="24"/>
+          <w:shd w:val="clear" w:color="auto" w:fill="auto"/>
+          <w:lang w:val="en-GB"/>
+        </w:rPr>
+        <w:t>Pull repo</w:t>
+      </w:r>
+      <w:r>
+        <w:rPr>
+          <w:rFonts w:hint="default"/>
+          <w:sz w:val="24"/>
+          <w:szCs w:val="24"/>
+          <w:shd w:val="clear" w:color="auto" w:fill="auto"/>
+          <w:lang w:val="en-GB"/>
+        </w:rPr>
+        <w:br w:type="textWrapping"/>
+      </w:r>
+      <w:r>
+        <w:rPr>
+          <w:rFonts w:hint="default"/>
+          <w:sz w:val="24"/>
+          <w:szCs w:val="24"/>
+          <w:shd w:val="clear" w:color="auto" w:fill="auto"/>
+          <w:lang w:val="en-GB"/>
+        </w:rPr>
+        <w:t>↓</w:t>
+      </w:r>
+      <w:r>
+        <w:rPr>
+          <w:rFonts w:hint="default"/>
+          <w:sz w:val="24"/>
+          <w:szCs w:val="24"/>
+          <w:shd w:val="clear" w:color="auto" w:fill="auto"/>
+          <w:lang w:val="en-GB"/>
+        </w:rPr>
+        <w:br w:type="textWrapping"/>
+      </w:r>
+      <w:r>
+        <w:rPr>
+          <w:rFonts w:hint="default"/>
+          <w:sz w:val="24"/>
+          <w:szCs w:val="24"/>
+          <w:shd w:val="clear" w:color="auto" w:fill="auto"/>
+          <w:lang w:val="en-GB"/>
+        </w:rPr>
+        <w:t>Install dependencies</w:t>
+      </w:r>
+      <w:r>
+        <w:rPr>
+          <w:rFonts w:hint="default"/>
+          <w:sz w:val="24"/>
+          <w:szCs w:val="24"/>
+          <w:shd w:val="clear" w:color="auto" w:fill="auto"/>
+          <w:lang w:val="en-GB"/>
+        </w:rPr>
+        <w:br w:type="textWrapping"/>
+      </w:r>
+      <w:r>
+        <w:rPr>
+          <w:rFonts w:hint="default"/>
+          <w:sz w:val="24"/>
+          <w:szCs w:val="24"/>
+          <w:shd w:val="clear" w:color="auto" w:fill="auto"/>
+          <w:lang w:val="en-GB"/>
+        </w:rPr>
+        <w:t>↓</w:t>
+      </w:r>
+      <w:r>
+        <w:rPr>
+          <w:rFonts w:hint="default"/>
+          <w:sz w:val="24"/>
+          <w:szCs w:val="24"/>
+          <w:shd w:val="clear" w:color="auto" w:fill="auto"/>
+          <w:lang w:val="en-GB"/>
+        </w:rPr>
+        <w:br w:type="textWrapping"/>
+      </w:r>
+      <w:r>
+        <w:rPr>
+          <w:rFonts w:hint="default"/>
+          <w:sz w:val="24"/>
+          <w:szCs w:val="24"/>
+          <w:shd w:val="clear" w:color="auto" w:fill="auto"/>
+          <w:lang w:val="en-GB"/>
+        </w:rPr>
+        <w:t>Verify Node</w:t>
+      </w:r>
+      <w:r>
+        <w:rPr>
+          <w:rFonts w:hint="default"/>
+          <w:sz w:val="24"/>
+          <w:szCs w:val="24"/>
+          <w:shd w:val="clear" w:color="auto" w:fill="auto"/>
+          <w:lang w:val="en-GB"/>
+        </w:rPr>
+        <w:br w:type="textWrapping"/>
+      </w:r>
+      <w:r>
+        <w:rPr>
+          <w:rFonts w:hint="default"/>
+          <w:sz w:val="24"/>
+          <w:szCs w:val="24"/>
+          <w:shd w:val="clear" w:color="auto" w:fill="auto"/>
+          <w:lang w:val="en-GB"/>
+        </w:rPr>
+        <w:t>↓</w:t>
+      </w:r>
+      <w:r>
+        <w:rPr>
+          <w:rFonts w:hint="default"/>
+          <w:sz w:val="24"/>
+          <w:szCs w:val="24"/>
+          <w:shd w:val="clear" w:color="auto" w:fill="auto"/>
+          <w:lang w:val="en-GB"/>
+        </w:rPr>
+        <w:br w:type="textWrapping"/>
+      </w:r>
+      <w:r>
+        <w:rPr>
+          <w:rFonts w:hint="default"/>
+          <w:sz w:val="24"/>
+          <w:szCs w:val="24"/>
+          <w:shd w:val="clear" w:color="auto" w:fill="auto"/>
+          <w:lang w:val="en-GB"/>
+        </w:rPr>
+        <w:t>Build Docker image</w:t>
+      </w:r>
+    </w:p>
+    <w:p>
+      <w:pPr>
+        <w:numPr>
+          <w:numId w:val="0"/>
+        </w:numPr>
+        <w:spacing w:line="360" w:lineRule="auto"/>
+        <w:ind w:leftChars="0"/>
+        <w:rPr>
+          <w:rFonts w:hint="default"/>
+          <w:sz w:val="24"/>
+          <w:szCs w:val="24"/>
+          <w:shd w:val="clear" w:color="auto" w:fill="auto"/>
+          <w:lang w:val="en-GB"/>
+        </w:rPr>
+      </w:pPr>
+    </w:p>
+    <w:p>
+      <w:pPr>
+        <w:numPr>
+          <w:numId w:val="0"/>
+        </w:numPr>
+        <w:spacing w:line="360" w:lineRule="auto"/>
+        <w:ind w:leftChars="0"/>
+        <w:rPr>
+          <w:rFonts w:hint="default"/>
+          <w:sz w:val="24"/>
+          <w:szCs w:val="24"/>
+          <w:shd w:val="clear" w:color="auto" w:fill="auto"/>
+          <w:lang w:val="en-GB"/>
+        </w:rPr>
+      </w:pPr>
+      <w:r>
+        <w:rPr>
+          <w:rFonts w:hint="default"/>
+          <w:sz w:val="24"/>
+          <w:szCs w:val="24"/>
+          <w:shd w:val="clear" w:color="auto" w:fill="auto"/>
+          <w:lang w:val="en-GB"/>
+        </w:rPr>
+        <w:t>By adding the Docker build stage, Jenkins can now automatically package the application into a container image whenever new code is pushed to GitHub.</w:t>
+      </w:r>
+    </w:p>
+    <w:p>
+      <w:pPr>
+        <w:numPr>
+          <w:numId w:val="0"/>
+        </w:numPr>
+        <w:spacing w:line="360" w:lineRule="auto"/>
+        <w:ind w:leftChars="0"/>
+        <w:rPr>
+          <w:rFonts w:hint="default"/>
+          <w:sz w:val="24"/>
+          <w:szCs w:val="24"/>
+          <w:shd w:val="clear" w:color="auto" w:fill="auto"/>
+          <w:lang w:val="en-GB"/>
+        </w:rPr>
+      </w:pPr>
+    </w:p>
+    <w:p>
+      <w:pPr>
+        <w:numPr>
+          <w:ilvl w:val="0"/>
+          <w:numId w:val="1"/>
+        </w:numPr>
+        <w:spacing w:line="360" w:lineRule="auto"/>
+        <w:ind w:left="0" w:leftChars="0" w:firstLine="0" w:firstLineChars="0"/>
+        <w:rPr>
+          <w:rFonts w:hint="default"/>
+          <w:sz w:val="24"/>
+          <w:szCs w:val="24"/>
+          <w:shd w:val="clear" w:color="auto" w:fill="auto"/>
+          <w:lang w:val="en-GB"/>
+        </w:rPr>
+      </w:pPr>
+      <w:r>
+        <w:rPr>
+          <w:rFonts w:hint="default"/>
+          <w:sz w:val="24"/>
+          <w:szCs w:val="24"/>
+          <w:shd w:val="clear" w:color="auto" w:fill="auto"/>
+          <w:lang w:val="en-GB"/>
+        </w:rPr>
+        <w:t>Push the Updated Jenkinsfile to GitHub</w:t>
+      </w:r>
+    </w:p>
+    <w:p>
+      <w:pPr>
+        <w:numPr>
+          <w:ilvl w:val="0"/>
+          <w:numId w:val="1"/>
+        </w:numPr>
+        <w:spacing w:line="360" w:lineRule="auto"/>
+        <w:ind w:left="0" w:leftChars="0" w:firstLine="0" w:firstLineChars="0"/>
+        <w:rPr>
+          <w:rFonts w:hint="default"/>
+          <w:sz w:val="24"/>
+          <w:szCs w:val="24"/>
+          <w:shd w:val="clear" w:color="auto" w:fill="auto"/>
+          <w:lang w:val="en-GB"/>
+        </w:rPr>
+      </w:pPr>
+      <w:r>
+        <w:rPr>
+          <w:rFonts w:hint="default"/>
+          <w:sz w:val="24"/>
+          <w:szCs w:val="24"/>
+          <w:shd w:val="clear" w:color="auto" w:fill="auto"/>
+          <w:lang w:val="en-GB"/>
+        </w:rPr>
+        <w:t>Verify the Docker Build : Go to your jenkins server and verify your console output</w:t>
+      </w:r>
+    </w:p>
+    <w:p>
+      <w:pPr>
+        <w:numPr>
+          <w:ilvl w:val="0"/>
+          <w:numId w:val="1"/>
+        </w:numPr>
+        <w:spacing w:line="360" w:lineRule="auto"/>
+        <w:ind w:left="0" w:leftChars="0" w:firstLine="0" w:firstLineChars="0"/>
+        <w:rPr>
+          <w:rFonts w:hint="default"/>
+          <w:sz w:val="24"/>
+          <w:szCs w:val="24"/>
+          <w:shd w:val="clear" w:color="auto" w:fill="auto"/>
+          <w:lang w:val="en-GB"/>
+        </w:rPr>
+      </w:pPr>
+      <w:r>
+        <w:rPr>
+          <w:rFonts w:hint="default"/>
+          <w:sz w:val="24"/>
+          <w:szCs w:val="24"/>
+          <w:shd w:val="clear" w:color="auto" w:fill="auto"/>
+          <w:lang w:val="en-GB"/>
+        </w:rPr>
+        <w:t>Confirm the Image e</w:t>
       </w:r>
       <w:bookmarkStart w:id="0" w:name="_GoBack"/>
       <w:bookmarkEnd w:id="0"/>
-    </w:p>
-    <w:p>
-      <w:pPr>
-        <w:numPr>
-          <w:ilvl w:val="0"/>
-          <w:numId w:val="1"/>
-        </w:numPr>
-        <w:spacing w:line="360" w:lineRule="auto"/>
-        <w:ind w:left="0" w:leftChars="0" w:firstLine="0" w:firstLineChars="0"/>
-        <w:rPr>
-          <w:rFonts w:hint="default"/>
-          <w:sz w:val="24"/>
-          <w:szCs w:val="24"/>
-          <w:shd w:val="clear" w:color="auto" w:fill="auto"/>
-          <w:lang w:val="en-GB"/>
-        </w:rPr>
-      </w:pPr>
-      <w:r>
-        <w:rPr>
-          <w:rFonts w:hint="default"/>
-          <w:sz w:val="24"/>
-          <w:szCs w:val="24"/>
-          <w:shd w:val="clear" w:color="auto" w:fill="auto"/>
-          <w:lang w:val="en-GB"/>
-        </w:rPr>
-        <w:t xml:space="preserve">Push Dockerfile to GitHub </w:t>
-      </w:r>
-    </w:p>
-    <w:p>
-      <w:pPr>
-        <w:numPr>
-          <w:ilvl w:val="0"/>
-          <w:numId w:val="0"/>
-        </w:numPr>
-        <w:spacing w:line="360" w:lineRule="auto"/>
-        <w:ind w:leftChars="0" w:firstLine="120" w:firstLineChars="50"/>
-        <w:rPr>
-          <w:rFonts w:hint="default"/>
-          <w:sz w:val="24"/>
-          <w:szCs w:val="24"/>
-          <w:shd w:val="clear" w:color="auto" w:fill="auto"/>
-          <w:lang w:val="en-GB"/>
-        </w:rPr>
-      </w:pPr>
-      <w:r>
-        <w:rPr>
-          <w:rFonts w:hint="default"/>
-          <w:sz w:val="24"/>
-          <w:szCs w:val="24"/>
-          <w:shd w:val="clear" w:color="auto" w:fill="auto"/>
-          <w:lang w:val="en-GB"/>
-        </w:rPr>
-        <w:t xml:space="preserve">Run </w:t>
-      </w:r>
-    </w:p>
-    <w:p>
-      <w:pPr>
-        <w:numPr>
-          <w:ilvl w:val="0"/>
-          <w:numId w:val="0"/>
-        </w:numPr>
-        <w:spacing w:line="360" w:lineRule="auto"/>
-        <w:ind w:leftChars="0" w:firstLine="120" w:firstLineChars="50"/>
+      <w:r>
+        <w:rPr>
+          <w:rFonts w:hint="default"/>
+          <w:sz w:val="24"/>
+          <w:szCs w:val="24"/>
+          <w:shd w:val="clear" w:color="auto" w:fill="auto"/>
+          <w:lang w:val="en-GB"/>
+        </w:rPr>
+        <w:t xml:space="preserve">xists on the Jenkins Server, Run : </w:t>
+      </w:r>
+      <w:r>
         <w:rPr>
           <w:rFonts w:hint="default"/>
           <w:sz w:val="24"/>
@@ -685,531 +1902,18 @@
           <w:shd w:val="clear" w:color="FFFFFF" w:fill="D9D9D9"/>
           <w:lang w:val="en-GB"/>
         </w:rPr>
-      </w:pPr>
-      <w:r>
-        <w:rPr>
-          <w:rFonts w:hint="default"/>
-          <w:sz w:val="24"/>
-          <w:szCs w:val="24"/>
-          <w:shd w:val="clear" w:color="FFFFFF" w:fill="D9D9D9"/>
-          <w:lang w:val="en-GB"/>
-        </w:rPr>
-        <w:t>git add Dockerfile</w:t>
-      </w:r>
-    </w:p>
-    <w:p>
-      <w:pPr>
-        <w:numPr>
-          <w:ilvl w:val="0"/>
-          <w:numId w:val="0"/>
-        </w:numPr>
-        <w:spacing w:line="360" w:lineRule="auto"/>
-        <w:ind w:leftChars="0" w:firstLine="120" w:firstLineChars="50"/>
-        <w:rPr>
-          <w:rFonts w:hint="default"/>
-          <w:sz w:val="24"/>
-          <w:szCs w:val="24"/>
-          <w:shd w:val="clear" w:color="FFFFFF" w:fill="D9D9D9"/>
-          <w:lang w:val="en-GB"/>
-        </w:rPr>
-      </w:pPr>
-      <w:r>
-        <w:rPr>
-          <w:rFonts w:hint="default"/>
-          <w:sz w:val="24"/>
-          <w:szCs w:val="24"/>
-          <w:shd w:val="clear" w:color="FFFFFF" w:fill="D9D9D9"/>
-          <w:lang w:val="en-GB"/>
-        </w:rPr>
-        <w:t>git commit -m "Add Dockerfile for containerization"</w:t>
-      </w:r>
-    </w:p>
-    <w:p>
-      <w:pPr>
-        <w:numPr>
-          <w:ilvl w:val="0"/>
-          <w:numId w:val="0"/>
-        </w:numPr>
-        <w:spacing w:line="360" w:lineRule="auto"/>
-        <w:ind w:leftChars="0" w:firstLine="120" w:firstLineChars="50"/>
-        <w:rPr>
-          <w:rFonts w:hint="default"/>
-          <w:sz w:val="24"/>
-          <w:szCs w:val="24"/>
-          <w:shd w:val="clear" w:color="auto" w:fill="auto"/>
-          <w:lang w:val="en-GB"/>
-        </w:rPr>
-      </w:pPr>
-      <w:r>
-        <w:rPr>
-          <w:rFonts w:hint="default"/>
-          <w:sz w:val="24"/>
-          <w:szCs w:val="24"/>
-          <w:shd w:val="clear" w:color="FFFFFF" w:fill="D9D9D9"/>
-          <w:lang w:val="en-GB"/>
-        </w:rPr>
-        <w:t xml:space="preserve">git push </w:t>
-      </w:r>
-      <w:r>
-        <w:rPr>
-          <w:rFonts w:hint="default"/>
-          <w:sz w:val="24"/>
-          <w:szCs w:val="24"/>
-          <w:shd w:val="clear" w:color="auto" w:fill="auto"/>
-          <w:lang w:val="en-GB"/>
-        </w:rPr>
-        <w:t xml:space="preserve"> </w:t>
-      </w:r>
-    </w:p>
-    <w:p>
-      <w:pPr>
-        <w:numPr>
-          <w:ilvl w:val="0"/>
-          <w:numId w:val="0"/>
-        </w:numPr>
-        <w:spacing w:line="360" w:lineRule="auto"/>
-        <w:rPr>
-          <w:rFonts w:hint="default"/>
-          <w:sz w:val="24"/>
-          <w:szCs w:val="24"/>
-          <w:shd w:val="clear" w:color="auto" w:fill="auto"/>
-          <w:lang w:val="en-GB"/>
-        </w:rPr>
-      </w:pPr>
-      <w:r>
-        <w:rPr>
-          <w:rFonts w:hint="default"/>
-          <w:sz w:val="24"/>
-          <w:szCs w:val="24"/>
-          <w:shd w:val="clear" w:color="auto" w:fill="auto"/>
-          <w:lang w:val="en-GB"/>
-        </w:rPr>
-        <w:t>Explanation:</w:t>
-      </w:r>
-    </w:p>
-    <w:p>
-      <w:pPr>
-        <w:numPr>
-          <w:ilvl w:val="0"/>
-          <w:numId w:val="0"/>
-        </w:numPr>
-        <w:spacing w:line="360" w:lineRule="auto"/>
-        <w:rPr>
-          <w:rFonts w:hint="default"/>
-          <w:sz w:val="24"/>
-          <w:szCs w:val="24"/>
-          <w:shd w:val="clear" w:color="auto" w:fill="auto"/>
-          <w:lang w:val="en-GB"/>
-        </w:rPr>
-      </w:pPr>
-      <w:r>
-        <w:rPr>
-          <w:rFonts w:hint="default"/>
-          <w:sz w:val="24"/>
-          <w:szCs w:val="24"/>
-          <w:shd w:val="clear" w:color="auto" w:fill="auto"/>
-          <w:lang w:val="en-GB"/>
-        </w:rPr>
-        <w:t>This uploads the Dockerfile to your GitHub repository so Jenkins can access it when running the CI pipeline.</w:t>
-      </w:r>
-    </w:p>
-    <w:p>
-      <w:pPr>
-        <w:numPr>
-          <w:ilvl w:val="0"/>
-          <w:numId w:val="0"/>
-        </w:numPr>
-        <w:spacing w:line="360" w:lineRule="auto"/>
-        <w:rPr>
-          <w:rFonts w:hint="default"/>
-          <w:sz w:val="24"/>
-          <w:szCs w:val="24"/>
-          <w:shd w:val="clear" w:color="auto" w:fill="auto"/>
-          <w:lang w:val="en-GB"/>
-        </w:rPr>
-      </w:pPr>
-      <w:r>
-        <w:rPr>
-          <w:rFonts w:hint="default"/>
-          <w:sz w:val="24"/>
-          <w:szCs w:val="24"/>
-          <w:shd w:val="clear" w:color="auto" w:fill="auto"/>
-          <w:lang w:val="en-GB"/>
-        </w:rPr>
-        <w:t>Because Jenkins is connected to GitHub through the webhook, pushing new code will automatically trigger a new Jenkins build.</w:t>
-      </w:r>
-    </w:p>
-    <w:p>
-      <w:pPr>
-        <w:numPr>
-          <w:ilvl w:val="0"/>
-          <w:numId w:val="0"/>
-        </w:numPr>
-        <w:spacing w:line="360" w:lineRule="auto"/>
-        <w:rPr>
-          <w:rFonts w:hint="default"/>
-          <w:sz w:val="24"/>
-          <w:szCs w:val="24"/>
-          <w:shd w:val="clear" w:color="auto" w:fill="auto"/>
-          <w:lang w:val="en-GB"/>
-        </w:rPr>
-      </w:pPr>
-    </w:p>
-    <w:p>
-      <w:pPr>
-        <w:numPr>
-          <w:ilvl w:val="0"/>
-          <w:numId w:val="1"/>
-        </w:numPr>
-        <w:spacing w:line="360" w:lineRule="auto"/>
-        <w:ind w:left="0" w:leftChars="0" w:firstLine="0" w:firstLineChars="0"/>
-        <w:rPr>
-          <w:rFonts w:hint="default"/>
-          <w:sz w:val="24"/>
-          <w:szCs w:val="24"/>
-          <w:shd w:val="clear" w:color="auto" w:fill="auto"/>
-          <w:lang w:val="en-GB"/>
-        </w:rPr>
-      </w:pPr>
-      <w:r>
-        <w:rPr>
-          <w:rFonts w:hint="default"/>
-          <w:sz w:val="24"/>
-          <w:szCs w:val="24"/>
-          <w:shd w:val="clear" w:color="auto" w:fill="auto"/>
-          <w:lang w:val="en-GB"/>
-        </w:rPr>
-        <w:t xml:space="preserve">install Docker on Jenkins Server </w:t>
-      </w:r>
-    </w:p>
-    <w:p>
-      <w:pPr>
-        <w:numPr>
-          <w:ilvl w:val="0"/>
-          <w:numId w:val="0"/>
-        </w:numPr>
-        <w:spacing w:line="360" w:lineRule="auto"/>
-        <w:ind w:leftChars="0"/>
-        <w:rPr>
-          <w:rFonts w:hint="default"/>
-          <w:sz w:val="24"/>
-          <w:szCs w:val="24"/>
-          <w:shd w:val="clear" w:color="FFFFFF" w:fill="D9D9D9"/>
-          <w:lang w:val="en-GB"/>
-        </w:rPr>
-      </w:pPr>
-      <w:r>
-        <w:rPr>
-          <w:rFonts w:hint="default"/>
-          <w:sz w:val="24"/>
-          <w:szCs w:val="24"/>
-          <w:shd w:val="clear" w:color="auto" w:fill="auto"/>
-          <w:lang w:val="en-GB"/>
-        </w:rPr>
-        <w:t xml:space="preserve">On your EC2 Jenkins server run: </w:t>
-      </w:r>
-      <w:r>
-        <w:rPr>
-          <w:rFonts w:hint="default"/>
-          <w:sz w:val="24"/>
-          <w:szCs w:val="24"/>
-          <w:shd w:val="clear" w:color="FFFFFF" w:fill="D9D9D9"/>
-          <w:lang w:val="en-GB"/>
-        </w:rPr>
-        <w:t>sudo apt update</w:t>
-      </w:r>
-    </w:p>
-    <w:p>
-      <w:pPr>
-        <w:numPr>
-          <w:ilvl w:val="0"/>
-          <w:numId w:val="0"/>
-        </w:numPr>
-        <w:spacing w:line="360" w:lineRule="auto"/>
-        <w:ind w:leftChars="0"/>
-        <w:rPr>
-          <w:rFonts w:hint="default"/>
-          <w:sz w:val="24"/>
-          <w:szCs w:val="24"/>
-          <w:shd w:val="clear" w:color="auto" w:fill="auto"/>
-          <w:lang w:val="en-GB"/>
-        </w:rPr>
-      </w:pPr>
-      <w:r>
-        <w:rPr>
-          <w:rFonts w:hint="default"/>
-          <w:sz w:val="24"/>
-          <w:szCs w:val="24"/>
-          <w:shd w:val="clear" w:color="FFFFFF" w:fill="D9D9D9"/>
-          <w:lang w:val="en-GB"/>
-        </w:rPr>
-        <w:t xml:space="preserve">sudo apt install docker.io -y </w:t>
-      </w:r>
-      <w:r>
-        <w:rPr>
-          <w:rFonts w:hint="default"/>
-          <w:sz w:val="24"/>
-          <w:szCs w:val="24"/>
-          <w:shd w:val="clear" w:color="auto" w:fill="auto"/>
-          <w:lang w:val="en-GB"/>
-        </w:rPr>
-        <w:t xml:space="preserve">  </w:t>
-      </w:r>
-    </w:p>
-    <w:p>
-      <w:pPr>
-        <w:numPr>
-          <w:ilvl w:val="0"/>
-          <w:numId w:val="0"/>
-        </w:numPr>
-        <w:spacing w:line="360" w:lineRule="auto"/>
-        <w:ind w:leftChars="0"/>
-        <w:rPr>
-          <w:rFonts w:hint="default"/>
-          <w:sz w:val="24"/>
-          <w:szCs w:val="24"/>
-          <w:shd w:val="clear" w:color="auto" w:fill="auto"/>
-          <w:lang w:val="en-GB"/>
-        </w:rPr>
-      </w:pPr>
-      <w:r>
-        <w:rPr>
-          <w:rFonts w:hint="default"/>
-          <w:sz w:val="24"/>
-          <w:szCs w:val="24"/>
-          <w:shd w:val="clear" w:color="auto" w:fill="auto"/>
-          <w:lang w:val="en-GB"/>
-        </w:rPr>
-        <w:t>Explanation:</w:t>
-      </w:r>
-      <w:r>
-        <w:rPr>
-          <w:rFonts w:hint="default"/>
-          <w:sz w:val="24"/>
-          <w:szCs w:val="24"/>
-          <w:shd w:val="clear" w:color="auto" w:fill="auto"/>
-          <w:lang w:val="en-GB"/>
-        </w:rPr>
-        <w:br w:type="textWrapping"/>
-      </w:r>
-      <w:r>
-        <w:rPr>
-          <w:rFonts w:hint="default"/>
-          <w:sz w:val="24"/>
-          <w:szCs w:val="24"/>
-          <w:shd w:val="clear" w:color="auto" w:fill="auto"/>
-          <w:lang w:val="en-GB"/>
-        </w:rPr>
-        <w:t>This installs Docker on the CI server so Jenkins can build container images.</w:t>
-      </w:r>
-    </w:p>
-    <w:p>
-      <w:pPr>
-        <w:numPr>
-          <w:ilvl w:val="0"/>
-          <w:numId w:val="0"/>
-        </w:numPr>
-        <w:spacing w:line="360" w:lineRule="auto"/>
-        <w:rPr>
-          <w:rFonts w:hint="default"/>
-          <w:sz w:val="24"/>
-          <w:szCs w:val="24"/>
-          <w:shd w:val="clear" w:color="auto" w:fill="auto"/>
-          <w:lang w:val="en-GB"/>
-        </w:rPr>
-      </w:pPr>
-    </w:p>
-    <w:p>
-      <w:pPr>
-        <w:numPr>
-          <w:ilvl w:val="0"/>
-          <w:numId w:val="1"/>
-        </w:numPr>
-        <w:spacing w:line="360" w:lineRule="auto"/>
-        <w:ind w:left="0" w:leftChars="0" w:firstLine="0" w:firstLineChars="0"/>
-        <w:rPr>
-          <w:rFonts w:hint="default"/>
-          <w:sz w:val="24"/>
-          <w:szCs w:val="24"/>
-          <w:shd w:val="clear" w:color="auto" w:fill="auto"/>
-          <w:lang w:val="en-GB"/>
-        </w:rPr>
-      </w:pPr>
-      <w:r>
-        <w:rPr>
-          <w:rFonts w:hint="default"/>
-          <w:sz w:val="24"/>
-          <w:szCs w:val="24"/>
-          <w:shd w:val="clear" w:color="auto" w:fill="auto"/>
-          <w:lang w:val="en-GB"/>
-        </w:rPr>
-        <w:t>Allow Jenkins to Use Docker</w:t>
-      </w:r>
-    </w:p>
-    <w:p>
-      <w:pPr>
-        <w:numPr>
-          <w:ilvl w:val="0"/>
-          <w:numId w:val="0"/>
-        </w:numPr>
-        <w:spacing w:line="360" w:lineRule="auto"/>
-        <w:ind w:leftChars="0"/>
-        <w:rPr>
-          <w:rFonts w:hint="default"/>
-          <w:sz w:val="24"/>
-          <w:szCs w:val="24"/>
-          <w:shd w:val="clear" w:color="auto" w:fill="auto"/>
-          <w:lang w:val="en-GB"/>
-        </w:rPr>
-      </w:pPr>
-      <w:r>
-        <w:rPr>
-          <w:rFonts w:hint="default"/>
-          <w:sz w:val="24"/>
-          <w:szCs w:val="24"/>
-          <w:shd w:val="clear" w:color="auto" w:fill="auto"/>
-          <w:lang w:val="en-GB"/>
-        </w:rPr>
-        <w:t xml:space="preserve">Run this: </w:t>
-      </w:r>
-      <w:r>
-        <w:rPr>
-          <w:rFonts w:hint="default"/>
-          <w:sz w:val="24"/>
-          <w:szCs w:val="24"/>
-          <w:shd w:val="clear" w:color="FFFFFF" w:fill="D9D9D9"/>
-          <w:lang w:val="en-GB"/>
-        </w:rPr>
-        <w:t>sudo usermod -aG docker jenkins</w:t>
-      </w:r>
-      <w:r>
-        <w:rPr>
-          <w:rFonts w:hint="default"/>
-          <w:sz w:val="24"/>
-          <w:szCs w:val="24"/>
-          <w:shd w:val="clear" w:color="FFFFFF" w:fill="D9D9D9"/>
-          <w:lang w:val="en-GB"/>
-        </w:rPr>
-        <w:br w:type="textWrapping"/>
-      </w:r>
-      <w:r>
-        <w:rPr>
-          <w:rFonts w:hint="default"/>
-          <w:sz w:val="24"/>
-          <w:szCs w:val="24"/>
-          <w:shd w:val="clear" w:color="FFFFFF" w:fill="D9D9D9"/>
-          <w:lang w:val="en-GB"/>
-        </w:rPr>
-        <w:t>sudo systemctl restart jenkins</w:t>
-      </w:r>
-      <w:r>
-        <w:rPr>
-          <w:rFonts w:hint="default"/>
-          <w:sz w:val="24"/>
-          <w:szCs w:val="24"/>
-          <w:shd w:val="clear" w:color="auto" w:fill="auto"/>
-          <w:lang w:val="en-GB"/>
-        </w:rPr>
-        <w:t xml:space="preserve"> </w:t>
-      </w:r>
-    </w:p>
-    <w:p>
-      <w:pPr>
-        <w:numPr>
-          <w:ilvl w:val="0"/>
-          <w:numId w:val="0"/>
-        </w:numPr>
-        <w:spacing w:line="360" w:lineRule="auto"/>
-        <w:ind w:leftChars="0"/>
-        <w:rPr>
-          <w:rFonts w:hint="default"/>
-          <w:sz w:val="24"/>
-          <w:szCs w:val="24"/>
-          <w:shd w:val="clear" w:color="auto" w:fill="auto"/>
-          <w:lang w:val="en-GB"/>
-        </w:rPr>
-      </w:pPr>
-      <w:r>
-        <w:rPr>
-          <w:rFonts w:hint="default"/>
-          <w:sz w:val="24"/>
-          <w:szCs w:val="24"/>
-          <w:shd w:val="clear" w:color="auto" w:fill="auto"/>
-          <w:lang w:val="en-GB"/>
-        </w:rPr>
-        <w:t>Explanation:</w:t>
-      </w:r>
-      <w:r>
-        <w:rPr>
-          <w:rFonts w:hint="default"/>
-          <w:sz w:val="24"/>
-          <w:szCs w:val="24"/>
-          <w:shd w:val="clear" w:color="auto" w:fill="auto"/>
-          <w:lang w:val="en-GB"/>
-        </w:rPr>
-        <w:br w:type="textWrapping"/>
-      </w:r>
-      <w:r>
-        <w:rPr>
-          <w:rFonts w:hint="default"/>
-          <w:sz w:val="24"/>
-          <w:szCs w:val="24"/>
-          <w:shd w:val="clear" w:color="auto" w:fill="auto"/>
-          <w:lang w:val="en-GB"/>
-        </w:rPr>
-        <w:t>Jenkins runs under its own user account, so we grant it permission to run Docker commands.</w:t>
-      </w:r>
-    </w:p>
-    <w:p>
-      <w:pPr>
-        <w:numPr>
-          <w:ilvl w:val="0"/>
-          <w:numId w:val="0"/>
-        </w:numPr>
-        <w:spacing w:line="360" w:lineRule="auto"/>
-        <w:ind w:leftChars="0"/>
-        <w:rPr>
-          <w:rFonts w:hint="default"/>
-          <w:sz w:val="24"/>
-          <w:szCs w:val="24"/>
-          <w:shd w:val="clear" w:color="auto" w:fill="auto"/>
-          <w:lang w:val="en-GB"/>
-        </w:rPr>
-      </w:pPr>
-    </w:p>
-    <w:p>
-      <w:pPr>
-        <w:numPr>
-          <w:ilvl w:val="0"/>
-          <w:numId w:val="0"/>
-        </w:numPr>
-        <w:spacing w:line="360" w:lineRule="auto"/>
-        <w:ind w:leftChars="0"/>
-        <w:rPr>
-          <w:rFonts w:hint="default"/>
-          <w:sz w:val="24"/>
-          <w:szCs w:val="24"/>
-          <w:shd w:val="clear" w:color="auto" w:fill="auto"/>
-          <w:lang w:val="en-GB"/>
-        </w:rPr>
-      </w:pPr>
-    </w:p>
-    <w:p>
-      <w:pPr>
-        <w:numPr>
-          <w:ilvl w:val="0"/>
-          <w:numId w:val="0"/>
-        </w:numPr>
-        <w:spacing w:line="360" w:lineRule="auto"/>
-        <w:ind w:leftChars="0"/>
-        <w:rPr>
-          <w:rFonts w:hint="default"/>
-          <w:sz w:val="24"/>
-          <w:szCs w:val="24"/>
-          <w:shd w:val="clear" w:color="auto" w:fill="auto"/>
-          <w:lang w:val="en-GB"/>
-        </w:rPr>
-      </w:pPr>
+        <w:t xml:space="preserve">docker images </w:t>
+      </w:r>
+      <w:r>
+        <w:rPr>
+          <w:rFonts w:hint="default"/>
+          <w:sz w:val="24"/>
+          <w:szCs w:val="24"/>
+          <w:shd w:val="clear" w:color="auto" w:fill="auto"/>
+          <w:lang w:val="en-GB"/>
+        </w:rPr>
+        <w:t xml:space="preserve">  you should see your task app image there</w:t>
+      </w:r>
     </w:p>
     <w:sectPr>
       <w:pgSz w:w="11906" w:h="16838"/>
@@ -1235,8 +1939,31 @@
       <w:lvlJc w:val="left"/>
     </w:lvl>
   </w:abstractNum>
+  <w:abstractNum w:abstractNumId="1">
+    <w:nsid w:val="376E4371"/>
+    <w:multiLevelType w:val="singleLevel"/>
+    <w:tmpl w:val="376E4371"/>
+    <w:lvl w:ilvl="0" w:tentative="0">
+      <w:start w:val="1"/>
+      <w:numFmt w:val="upperRoman"/>
+      <w:lvlText w:val="%1."/>
+      <w:lvlJc w:val="left"/>
+      <w:pPr>
+        <w:tabs>
+          <w:tab w:val="left" w:pos="425"/>
+        </w:tabs>
+        <w:ind w:left="425" w:leftChars="0" w:hanging="425" w:firstLineChars="0"/>
+      </w:pPr>
+      <w:rPr>
+        <w:rFonts w:hint="default"/>
+      </w:rPr>
+    </w:lvl>
+  </w:abstractNum>
   <w:num w:numId="1">
     <w:abstractNumId w:val="0"/>
+  </w:num>
+  <w:num w:numId="2">
+    <w:abstractNumId w:val="1"/>
   </w:num>
 </w:numbering>
 </file>

</xml_diff>

<commit_message>
Automate Docker push in Jenkins
</commit_message>
<xml_diff>
--- a/Screenshots & Notes/TASK APP week-4.docx
+++ b/Screenshots & Notes/TASK APP week-4.docx
@@ -1641,16 +1641,6 @@
           <w:shd w:val="clear" w:color="auto" w:fill="auto"/>
           <w:lang w:val="en-GB"/>
         </w:rPr>
-        <w:t>↓</w:t>
-      </w:r>
-      <w:r>
-        <w:rPr>
-          <w:rFonts w:hint="default"/>
-          <w:sz w:val="24"/>
-          <w:szCs w:val="24"/>
-          <w:shd w:val="clear" w:color="auto" w:fill="auto"/>
-          <w:lang w:val="en-GB"/>
-        </w:rPr>
         <w:br w:type="textWrapping"/>
       </w:r>
       <w:r>
@@ -1681,16 +1671,6 @@
           <w:shd w:val="clear" w:color="auto" w:fill="auto"/>
           <w:lang w:val="en-GB"/>
         </w:rPr>
-        <w:t>↓</w:t>
-      </w:r>
-      <w:r>
-        <w:rPr>
-          <w:rFonts w:hint="default"/>
-          <w:sz w:val="24"/>
-          <w:szCs w:val="24"/>
-          <w:shd w:val="clear" w:color="auto" w:fill="auto"/>
-          <w:lang w:val="en-GB"/>
-        </w:rPr>
         <w:br w:type="textWrapping"/>
       </w:r>
       <w:r>
@@ -1721,16 +1701,6 @@
           <w:shd w:val="clear" w:color="auto" w:fill="auto"/>
           <w:lang w:val="en-GB"/>
         </w:rPr>
-        <w:t>↓</w:t>
-      </w:r>
-      <w:r>
-        <w:rPr>
-          <w:rFonts w:hint="default"/>
-          <w:sz w:val="24"/>
-          <w:szCs w:val="24"/>
-          <w:shd w:val="clear" w:color="auto" w:fill="auto"/>
-          <w:lang w:val="en-GB"/>
-        </w:rPr>
         <w:br w:type="textWrapping"/>
       </w:r>
       <w:r>
@@ -1880,40 +1850,85 @@
           <w:shd w:val="clear" w:color="auto" w:fill="auto"/>
           <w:lang w:val="en-GB"/>
         </w:rPr>
-        <w:t>Confirm the Image e</w:t>
+        <w:t xml:space="preserve">Confirm the Image exists on the Jenkins Server, Run : </w:t>
+      </w:r>
+      <w:r>
+        <w:rPr>
+          <w:rFonts w:hint="default"/>
+          <w:sz w:val="24"/>
+          <w:szCs w:val="24"/>
+          <w:shd w:val="clear" w:color="FFFFFF" w:fill="D9D9D9"/>
+          <w:lang w:val="en-GB"/>
+        </w:rPr>
+        <w:t xml:space="preserve">docker images </w:t>
+      </w:r>
+      <w:r>
+        <w:rPr>
+          <w:rFonts w:hint="default"/>
+          <w:sz w:val="24"/>
+          <w:szCs w:val="24"/>
+          <w:shd w:val="clear" w:color="auto" w:fill="auto"/>
+          <w:lang w:val="en-GB"/>
+        </w:rPr>
+        <w:t xml:space="preserve">  you should see your task app image there</w:t>
+      </w:r>
+    </w:p>
+    <w:p>
+      <w:pPr>
+        <w:numPr>
+          <w:numId w:val="0"/>
+        </w:numPr>
+        <w:spacing w:line="360" w:lineRule="auto"/>
+        <w:rPr>
+          <w:rFonts w:hint="default"/>
+          <w:sz w:val="24"/>
+          <w:szCs w:val="24"/>
+          <w:shd w:val="clear" w:color="auto" w:fill="auto"/>
+          <w:lang w:val="en-GB"/>
+        </w:rPr>
+      </w:pPr>
+    </w:p>
+    <w:p>
+      <w:pPr>
+        <w:numPr>
+          <w:numId w:val="0"/>
+        </w:numPr>
+        <w:spacing w:line="360" w:lineRule="auto"/>
+        <w:rPr>
+          <w:rFonts w:hint="default"/>
+          <w:sz w:val="24"/>
+          <w:szCs w:val="24"/>
+          <w:shd w:val="clear" w:color="auto" w:fill="auto"/>
+          <w:lang w:val="en-GB"/>
+        </w:rPr>
+      </w:pPr>
+    </w:p>
+    <w:p>
+      <w:pPr>
+        <w:numPr>
+          <w:numId w:val="0"/>
+        </w:numPr>
+        <w:spacing w:line="360" w:lineRule="auto"/>
+        <w:rPr>
+          <w:rFonts w:hint="default"/>
+          <w:sz w:val="24"/>
+          <w:szCs w:val="24"/>
+          <w:shd w:val="clear" w:color="auto" w:fill="auto"/>
+          <w:lang w:val="en-GB"/>
+        </w:rPr>
+      </w:pPr>
+      <w:r>
+        <w:rPr>
+          <w:rFonts w:hint="default"/>
+          <w:sz w:val="24"/>
+          <w:szCs w:val="24"/>
+          <w:shd w:val="clear" w:color="auto" w:fill="auto"/>
+          <w:lang w:val="en-GB"/>
+        </w:rPr>
+        <w:t xml:space="preserve">Summary:  In this step we automated container creation. Every time code is pushed, Jenkins now builds a Docker image of the application and include updates and new versions. </w:t>
       </w:r>
       <w:bookmarkStart w:id="0" w:name="_GoBack"/>
       <w:bookmarkEnd w:id="0"/>
-      <w:r>
-        <w:rPr>
-          <w:rFonts w:hint="default"/>
-          <w:sz w:val="24"/>
-          <w:szCs w:val="24"/>
-          <w:shd w:val="clear" w:color="auto" w:fill="auto"/>
-          <w:lang w:val="en-GB"/>
-        </w:rPr>
-        <w:t xml:space="preserve">xists on the Jenkins Server, Run : </w:t>
-      </w:r>
-      <w:r>
-        <w:rPr>
-          <w:rFonts w:hint="default"/>
-          <w:sz w:val="24"/>
-          <w:szCs w:val="24"/>
-          <w:shd w:val="clear" w:color="FFFFFF" w:fill="D9D9D9"/>
-          <w:lang w:val="en-GB"/>
-        </w:rPr>
-        <w:t xml:space="preserve">docker images </w:t>
-      </w:r>
-      <w:r>
-        <w:rPr>
-          <w:rFonts w:hint="default"/>
-          <w:sz w:val="24"/>
-          <w:szCs w:val="24"/>
-          <w:shd w:val="clear" w:color="auto" w:fill="auto"/>
-          <w:lang w:val="en-GB"/>
-        </w:rPr>
-        <w:t xml:space="preserve">  you should see your task app image there</w:t>
-      </w:r>
     </w:p>
     <w:sectPr>
       <w:pgSz w:w="11906" w:h="16838"/>

</xml_diff>